<commit_message>
add contractor hub and updated cv
</commit_message>
<xml_diff>
--- a/Gurdip_Bath_CV_Final.docx
+++ b/Gurdip_Bath_CV_Final.docx
@@ -20,12 +20,6 @@
         <w:gridCol w:w="3360"/>
       </w:tblGrid>
       <w:tr>
-        <w:tblPrEx>
-          <w:tblCellMar>
-            <w:top w:w="0" w:type="dxa"/>
-            <w:bottom w:w="0" w:type="dxa"/>
-          </w:tblCellMar>
-        </w:tblPrEx>
         <w:tc>
           <w:tcPr>
             <w:tcW w:w="6000" w:type="dxa"/>
@@ -134,7 +128,25 @@
                 <w:sz w:val="18"/>
                 <w:szCs w:val="18"/>
               </w:rPr>
-              <w:t>Bathgurdip2@gmail.com</w:t>
+              <w:t>Bathgurdip</w:t>
+            </w:r>
+            <w:r>
+              <w:rPr>
+                <w:rFonts w:ascii="Arial" w:eastAsia="Arial" w:hAnsi="Arial" w:cs="Arial"/>
+                <w:color w:val="B8D0E8"/>
+                <w:sz w:val="18"/>
+                <w:szCs w:val="18"/>
+              </w:rPr>
+              <w:t>1</w:t>
+            </w:r>
+            <w:r>
+              <w:rPr>
+                <w:rFonts w:ascii="Arial" w:eastAsia="Arial" w:hAnsi="Arial" w:cs="Arial"/>
+                <w:color w:val="B8D0E8"/>
+                <w:sz w:val="18"/>
+                <w:szCs w:val="18"/>
+              </w:rPr>
+              <w:t>@gmail.com</w:t>
             </w:r>
           </w:p>
         </w:tc>
@@ -180,7 +192,97 @@
           <w:sz w:val="19"/>
           <w:szCs w:val="19"/>
         </w:rPr>
-        <w:t xml:space="preserve">Microsoft Power Platform Developer with a background in HR Shared Services, bringing genuine domain expertise to enterprise solution design. Independently built the Employee Lifecycle Hub — a production-grade Power Platform solution covering Dataverse, Model-Driven Apps, Canvas Apps, Power Automate, Power BI, and ALM — and delivered a live PWA for a real client through GMB Software Solutions. Active LinkedIn presence with 2,000+ followers and individual posts exceeding 60,000 impressions — </w:t>
+        <w:t xml:space="preserve">Microsoft Power Platform Developer with a background in HR Shared Services, bringing genuine domain expertise to enterprise solution design. Independently built </w:t>
+      </w:r>
+      <w:r>
+        <w:rPr>
+          <w:rFonts w:ascii="Arial" w:eastAsia="Arial" w:hAnsi="Arial" w:cs="Arial"/>
+          <w:color w:val="595959"/>
+          <w:sz w:val="19"/>
+          <w:szCs w:val="19"/>
+        </w:rPr>
+        <w:t>multiple projects to</w:t>
+      </w:r>
+      <w:r>
+        <w:rPr>
+          <w:rFonts w:ascii="Arial" w:eastAsia="Arial" w:hAnsi="Arial" w:cs="Arial"/>
+          <w:color w:val="595959"/>
+          <w:sz w:val="19"/>
+          <w:szCs w:val="19"/>
+        </w:rPr>
+        <w:t xml:space="preserve"> a production-grade </w:t>
+      </w:r>
+      <w:r>
+        <w:rPr>
+          <w:rFonts w:ascii="Arial" w:eastAsia="Arial" w:hAnsi="Arial" w:cs="Arial"/>
+          <w:color w:val="595959"/>
+          <w:sz w:val="19"/>
+          <w:szCs w:val="19"/>
+        </w:rPr>
+        <w:t xml:space="preserve">level </w:t>
+      </w:r>
+      <w:r>
+        <w:rPr>
+          <w:rFonts w:ascii="Arial" w:eastAsia="Arial" w:hAnsi="Arial" w:cs="Arial"/>
+          <w:color w:val="595959"/>
+          <w:sz w:val="19"/>
+          <w:szCs w:val="19"/>
+        </w:rPr>
+        <w:t xml:space="preserve">using </w:t>
+      </w:r>
+      <w:r>
+        <w:rPr>
+          <w:rFonts w:ascii="Arial" w:eastAsia="Arial" w:hAnsi="Arial" w:cs="Arial"/>
+          <w:color w:val="595959"/>
+          <w:sz w:val="19"/>
+          <w:szCs w:val="19"/>
+        </w:rPr>
+        <w:t>Power Platform covering Dataverse, Model-Driven Apps, Canvas Apps, Power Automate</w:t>
+      </w:r>
+      <w:r>
+        <w:rPr>
+          <w:rFonts w:ascii="Arial" w:eastAsia="Arial" w:hAnsi="Arial" w:cs="Arial"/>
+          <w:color w:val="595959"/>
+          <w:sz w:val="19"/>
+          <w:szCs w:val="19"/>
+        </w:rPr>
+        <w:t xml:space="preserve"> </w:t>
+      </w:r>
+      <w:r>
+        <w:rPr>
+          <w:rFonts w:ascii="Arial" w:eastAsia="Arial" w:hAnsi="Arial" w:cs="Arial"/>
+          <w:color w:val="595959"/>
+          <w:sz w:val="19"/>
+          <w:szCs w:val="19"/>
+        </w:rPr>
+        <w:t>and ALM</w:t>
+      </w:r>
+      <w:r>
+        <w:rPr>
+          <w:rFonts w:ascii="Arial" w:eastAsia="Arial" w:hAnsi="Arial" w:cs="Arial"/>
+          <w:color w:val="595959"/>
+          <w:sz w:val="19"/>
+          <w:szCs w:val="19"/>
+        </w:rPr>
+        <w:t>. D</w:t>
+      </w:r>
+      <w:r>
+        <w:rPr>
+          <w:rFonts w:ascii="Arial" w:eastAsia="Arial" w:hAnsi="Arial" w:cs="Arial"/>
+          <w:color w:val="595959"/>
+          <w:sz w:val="19"/>
+          <w:szCs w:val="19"/>
+        </w:rPr>
+        <w:t>elivered a live PWA for a real client through GMB Software Solutions. Active LinkedIn presence with 2,000+ followers and individual posts exceeding 60,000 impressions</w:t>
+      </w:r>
+      <w:r>
+        <w:rPr>
+          <w:rFonts w:ascii="Arial" w:eastAsia="Arial" w:hAnsi="Arial" w:cs="Arial"/>
+          <w:color w:val="595959"/>
+          <w:sz w:val="19"/>
+          <w:szCs w:val="19"/>
+        </w:rPr>
+        <w:t xml:space="preserve">: </w:t>
       </w:r>
       <w:hyperlink r:id="rId7" w:history="1">
         <w:r>
@@ -190,7 +292,54 @@
             <w:sz w:val="19"/>
             <w:szCs w:val="19"/>
           </w:rPr>
-          <w:t>view profile</w:t>
+          <w:t>view</w:t>
+        </w:r>
+        <w:r>
+          <w:rPr>
+            <w:rStyle w:val="Hyperlink"/>
+            <w:rFonts w:ascii="Arial" w:eastAsia="Arial" w:hAnsi="Arial" w:cs="Arial"/>
+            <w:sz w:val="19"/>
+            <w:szCs w:val="19"/>
+          </w:rPr>
+          <w:t xml:space="preserve"> </w:t>
+        </w:r>
+        <w:proofErr w:type="spellStart"/>
+        <w:r>
+          <w:rPr>
+            <w:rStyle w:val="Hyperlink"/>
+            <w:rFonts w:ascii="Arial" w:eastAsia="Arial" w:hAnsi="Arial" w:cs="Arial"/>
+            <w:sz w:val="19"/>
+            <w:szCs w:val="19"/>
+          </w:rPr>
+          <w:t>linkedin</w:t>
+        </w:r>
+        <w:proofErr w:type="spellEnd"/>
+        <w:r>
+          <w:rPr>
+            <w:rStyle w:val="Hyperlink"/>
+            <w:rFonts w:ascii="Arial" w:eastAsia="Arial" w:hAnsi="Arial" w:cs="Arial"/>
+            <w:sz w:val="19"/>
+            <w:szCs w:val="19"/>
+          </w:rPr>
+          <w:t xml:space="preserve"> pr</w:t>
+        </w:r>
+        <w:r>
+          <w:rPr>
+            <w:rStyle w:val="Hyperlink"/>
+            <w:rFonts w:ascii="Arial" w:eastAsia="Arial" w:hAnsi="Arial" w:cs="Arial"/>
+            <w:sz w:val="19"/>
+            <w:szCs w:val="19"/>
+          </w:rPr>
+          <w:t>o</w:t>
+        </w:r>
+        <w:r>
+          <w:rPr>
+            <w:rStyle w:val="Hyperlink"/>
+            <w:rFonts w:ascii="Arial" w:eastAsia="Arial" w:hAnsi="Arial" w:cs="Arial"/>
+            <w:sz w:val="19"/>
+            <w:szCs w:val="19"/>
+          </w:rPr>
+          <w:t>file</w:t>
         </w:r>
       </w:hyperlink>
       <w:r>
@@ -216,7 +365,18 @@
           <w:sz w:val="26"/>
           <w:szCs w:val="26"/>
         </w:rPr>
-        <w:t>Key Project</w:t>
+        <w:t>Project</w:t>
+      </w:r>
+      <w:r>
+        <w:rPr>
+          <w:rFonts w:ascii="Arial" w:eastAsia="Arial" w:hAnsi="Arial" w:cs="Arial"/>
+          <w:b/>
+          <w:bCs/>
+          <w:color w:val="1F3864"/>
+          <w:sz w:val="26"/>
+          <w:szCs w:val="26"/>
+        </w:rPr>
+        <w:t>s</w:t>
       </w:r>
     </w:p>
     <w:p>
@@ -244,12 +404,6 @@
         <w:gridCol w:w="9360"/>
       </w:tblGrid>
       <w:tr>
-        <w:tblPrEx>
-          <w:tblCellMar>
-            <w:top w:w="0" w:type="dxa"/>
-            <w:bottom w:w="0" w:type="dxa"/>
-          </w:tblCellMar>
-        </w:tblPrEx>
         <w:tc>
           <w:tcPr>
             <w:tcW w:w="9360" w:type="dxa"/>
@@ -445,6 +599,332 @@
         <w:t>Established a reusable 16-point Power Platform delivery framework covering governance, scalability, concurrency, observability, retry strategy, ALM portability, security, and flow resiliency.</w:t>
       </w:r>
     </w:p>
+    <w:tbl>
+      <w:tblPr>
+        <w:tblW w:w="9360" w:type="dxa"/>
+        <w:tblBorders>
+          <w:insideH w:val="single" w:sz="4" w:space="0" w:color="auto"/>
+          <w:insideV w:val="single" w:sz="4" w:space="0" w:color="auto"/>
+        </w:tblBorders>
+        <w:tblCellMar>
+          <w:left w:w="10" w:type="dxa"/>
+          <w:right w:w="10" w:type="dxa"/>
+        </w:tblCellMar>
+        <w:tblLook w:val="0000" w:firstRow="0" w:lastRow="0" w:firstColumn="0" w:lastColumn="0" w:noHBand="0" w:noVBand="0"/>
+      </w:tblPr>
+      <w:tblGrid>
+        <w:gridCol w:w="9360"/>
+      </w:tblGrid>
+      <w:tr>
+        <w:tc>
+          <w:tcPr>
+            <w:tcW w:w="9360" w:type="dxa"/>
+            <w:shd w:val="clear" w:color="auto" w:fill="D6E4F0"/>
+            <w:tcMar>
+              <w:top w:w="80" w:type="dxa"/>
+              <w:left w:w="160" w:type="dxa"/>
+              <w:bottom w:w="80" w:type="dxa"/>
+              <w:right w:w="160" w:type="dxa"/>
+            </w:tcMar>
+          </w:tcPr>
+          <w:p>
+            <w:r>
+              <w:rPr>
+                <w:rFonts w:ascii="Arial" w:eastAsia="Arial" w:hAnsi="Arial" w:cs="Arial"/>
+                <w:b/>
+                <w:bCs/>
+                <w:color w:val="1F3864"/>
+                <w:sz w:val="22"/>
+                <w:szCs w:val="22"/>
+              </w:rPr>
+              <w:t>Contractor Hub</w:t>
+            </w:r>
+          </w:p>
+        </w:tc>
+      </w:tr>
+    </w:tbl>
+    <w:p>
+      <w:pPr>
+        <w:pStyle w:val="ListParagraph"/>
+        <w:numPr>
+          <w:ilvl w:val="0"/>
+          <w:numId w:val="2"/>
+        </w:numPr>
+        <w:spacing w:after="60"/>
+        <w:rPr>
+          <w:rFonts w:ascii="Arial" w:eastAsia="Arial" w:hAnsi="Arial" w:cs="Arial"/>
+          <w:color w:val="595959"/>
+          <w:sz w:val="19"/>
+          <w:szCs w:val="19"/>
+        </w:rPr>
+      </w:pPr>
+      <w:r>
+        <w:rPr>
+          <w:rFonts w:ascii="Arial" w:eastAsia="Arial" w:hAnsi="Arial" w:cs="Arial"/>
+          <w:color w:val="595959"/>
+          <w:sz w:val="19"/>
+          <w:szCs w:val="19"/>
+        </w:rPr>
+        <w:t xml:space="preserve">Built a full contractor management solution on Power Platform, covering everything from initial intake through to project delivery </w:t>
+      </w:r>
+      <w:r>
+        <w:rPr>
+          <w:rFonts w:ascii="Arial" w:eastAsia="Arial" w:hAnsi="Arial" w:cs="Arial"/>
+          <w:color w:val="595959"/>
+          <w:sz w:val="19"/>
+          <w:szCs w:val="19"/>
+        </w:rPr>
+        <w:t xml:space="preserve">consisting of </w:t>
+      </w:r>
+      <w:r>
+        <w:rPr>
+          <w:rFonts w:ascii="Arial" w:eastAsia="Arial" w:hAnsi="Arial" w:cs="Arial"/>
+          <w:color w:val="595959"/>
+          <w:sz w:val="19"/>
+          <w:szCs w:val="19"/>
+        </w:rPr>
+        <w:t xml:space="preserve">contracts, certifications, compliance docs, assignments, and timesheets all sitting in one place, backed by Dataverse. </w:t>
+      </w:r>
+    </w:p>
+    <w:p>
+      <w:pPr>
+        <w:pStyle w:val="ListParagraph"/>
+        <w:numPr>
+          <w:ilvl w:val="0"/>
+          <w:numId w:val="2"/>
+        </w:numPr>
+        <w:spacing w:after="60"/>
+        <w:rPr>
+          <w:rFonts w:ascii="Arial" w:eastAsia="Arial" w:hAnsi="Arial" w:cs="Arial"/>
+          <w:color w:val="595959"/>
+          <w:sz w:val="19"/>
+          <w:szCs w:val="19"/>
+        </w:rPr>
+      </w:pPr>
+      <w:r>
+        <w:rPr>
+          <w:rFonts w:ascii="Arial" w:eastAsia="Arial" w:hAnsi="Arial" w:cs="Arial"/>
+          <w:color w:val="595959"/>
+          <w:sz w:val="19"/>
+          <w:szCs w:val="19"/>
+        </w:rPr>
+        <w:t xml:space="preserve">Designed the data model from scratch: 13 custom Dataverse tables with auto-number IDs, proper lookup relationships across contractors, contracts, projects, assignments and timesheets, plus a junction table to handle the many-to-many between contractors and their certifications. </w:t>
+      </w:r>
+    </w:p>
+    <w:p>
+      <w:pPr>
+        <w:pStyle w:val="ListParagraph"/>
+        <w:numPr>
+          <w:ilvl w:val="0"/>
+          <w:numId w:val="2"/>
+        </w:numPr>
+        <w:spacing w:after="60"/>
+        <w:rPr>
+          <w:rFonts w:ascii="Arial" w:eastAsia="Arial" w:hAnsi="Arial" w:cs="Arial"/>
+          <w:color w:val="595959"/>
+          <w:sz w:val="19"/>
+          <w:szCs w:val="19"/>
+        </w:rPr>
+      </w:pPr>
+      <w:r>
+        <w:rPr>
+          <w:rFonts w:ascii="Arial" w:eastAsia="Arial" w:hAnsi="Arial" w:cs="Arial"/>
+          <w:color w:val="595959"/>
+          <w:sz w:val="19"/>
+          <w:szCs w:val="19"/>
+        </w:rPr>
+        <w:t xml:space="preserve">Built a two-stage Business Process Flow that guides users through capturing the right contractor data at intake, then triggers a Power Automate flow automatically when they advance to stage two — rather than relying on a manual button or separate process kick-off. </w:t>
+      </w:r>
+    </w:p>
+    <w:p>
+      <w:pPr>
+        <w:pStyle w:val="ListParagraph"/>
+        <w:numPr>
+          <w:ilvl w:val="0"/>
+          <w:numId w:val="2"/>
+        </w:numPr>
+        <w:spacing w:after="60"/>
+        <w:rPr>
+          <w:rFonts w:ascii="Arial" w:eastAsia="Arial" w:hAnsi="Arial" w:cs="Arial"/>
+          <w:color w:val="595959"/>
+          <w:sz w:val="19"/>
+          <w:szCs w:val="19"/>
+        </w:rPr>
+      </w:pPr>
+      <w:r>
+        <w:rPr>
+          <w:rFonts w:ascii="Arial" w:eastAsia="Arial" w:hAnsi="Arial" w:cs="Arial"/>
+          <w:color w:val="595959"/>
+          <w:sz w:val="19"/>
+          <w:szCs w:val="19"/>
+        </w:rPr>
+        <w:t xml:space="preserve">Created a Power Automate flow that fires when the BPF step is executed </w:t>
+      </w:r>
+      <w:r>
+        <w:rPr>
+          <w:rFonts w:ascii="Arial" w:eastAsia="Arial" w:hAnsi="Arial" w:cs="Arial"/>
+          <w:color w:val="595959"/>
+          <w:sz w:val="19"/>
+          <w:szCs w:val="19"/>
+        </w:rPr>
+        <w:t xml:space="preserve">which </w:t>
+      </w:r>
+      <w:r>
+        <w:rPr>
+          <w:rFonts w:ascii="Arial" w:eastAsia="Arial" w:hAnsi="Arial" w:cs="Arial"/>
+          <w:color w:val="595959"/>
+          <w:sz w:val="19"/>
+          <w:szCs w:val="19"/>
+        </w:rPr>
+        <w:t xml:space="preserve">sends a team notification via Outlook, then writes back to the Contractor record in Dataverse to confirm it happened. Simple, but auditable. </w:t>
+      </w:r>
+    </w:p>
+    <w:p>
+      <w:pPr>
+        <w:pStyle w:val="ListParagraph"/>
+        <w:numPr>
+          <w:ilvl w:val="0"/>
+          <w:numId w:val="2"/>
+        </w:numPr>
+        <w:spacing w:after="60"/>
+        <w:rPr>
+          <w:rFonts w:ascii="Arial" w:eastAsia="Arial" w:hAnsi="Arial" w:cs="Arial"/>
+          <w:color w:val="595959"/>
+          <w:sz w:val="19"/>
+          <w:szCs w:val="19"/>
+        </w:rPr>
+      </w:pPr>
+      <w:r>
+        <w:rPr>
+          <w:rFonts w:ascii="Arial" w:eastAsia="Arial" w:hAnsi="Arial" w:cs="Arial"/>
+          <w:color w:val="595959"/>
+          <w:sz w:val="19"/>
+          <w:szCs w:val="19"/>
+        </w:rPr>
+        <w:t xml:space="preserve">Delivered the Model-Driven App with a structured nav split into two areas </w:t>
+      </w:r>
+      <w:r>
+        <w:rPr>
+          <w:rFonts w:ascii="Arial" w:eastAsia="Arial" w:hAnsi="Arial" w:cs="Arial"/>
+          <w:color w:val="595959"/>
+          <w:sz w:val="19"/>
+          <w:szCs w:val="19"/>
+        </w:rPr>
+        <w:t xml:space="preserve">for </w:t>
+      </w:r>
+      <w:r>
+        <w:rPr>
+          <w:rFonts w:ascii="Arial" w:eastAsia="Arial" w:hAnsi="Arial" w:cs="Arial"/>
+          <w:color w:val="595959"/>
+          <w:sz w:val="19"/>
+          <w:szCs w:val="19"/>
+        </w:rPr>
+        <w:t xml:space="preserve">Contractor Management and Project Delivery so different users land in the right context without unnecessary noise. </w:t>
+      </w:r>
+    </w:p>
+    <w:p>
+      <w:pPr>
+        <w:pStyle w:val="ListParagraph"/>
+        <w:numPr>
+          <w:ilvl w:val="0"/>
+          <w:numId w:val="2"/>
+        </w:numPr>
+        <w:spacing w:after="60"/>
+        <w:rPr>
+          <w:rFonts w:ascii="Arial" w:eastAsia="Arial" w:hAnsi="Arial" w:cs="Arial"/>
+          <w:color w:val="595959"/>
+          <w:sz w:val="19"/>
+          <w:szCs w:val="19"/>
+        </w:rPr>
+      </w:pPr>
+      <w:r>
+        <w:rPr>
+          <w:rFonts w:ascii="Arial" w:eastAsia="Arial" w:hAnsi="Arial" w:cs="Arial"/>
+          <w:color w:val="595959"/>
+          <w:sz w:val="19"/>
+          <w:szCs w:val="19"/>
+        </w:rPr>
+        <w:t xml:space="preserve">Wrote three custom JavaScript web resources to handle form behaviour: logic on the certification form, and a risk-scoring script on the Contract form that flags a warning banner if a contract has expired, the email field is empty, or no skills have been tagged. Catches data quality issues before they become problems. </w:t>
+      </w:r>
+    </w:p>
+    <w:p>
+      <w:pPr>
+        <w:pStyle w:val="ListParagraph"/>
+        <w:numPr>
+          <w:ilvl w:val="0"/>
+          <w:numId w:val="2"/>
+        </w:numPr>
+        <w:spacing w:after="60"/>
+        <w:rPr>
+          <w:rFonts w:ascii="Arial" w:eastAsia="Arial" w:hAnsi="Arial" w:cs="Arial"/>
+          <w:color w:val="595959"/>
+          <w:sz w:val="19"/>
+          <w:szCs w:val="19"/>
+        </w:rPr>
+      </w:pPr>
+      <w:r>
+        <w:rPr>
+          <w:rFonts w:ascii="Arial" w:eastAsia="Arial" w:hAnsi="Arial" w:cs="Arial"/>
+          <w:color w:val="595959"/>
+          <w:sz w:val="19"/>
+          <w:szCs w:val="19"/>
+        </w:rPr>
+        <w:lastRenderedPageBreak/>
+        <w:t>Set up three security roles (Contractor, Project Management, General Management) to make sure each user type only sees and does what they're supposed t</w:t>
+      </w:r>
+      <w:r>
+        <w:rPr>
+          <w:rFonts w:ascii="Arial" w:eastAsia="Arial" w:hAnsi="Arial" w:cs="Arial"/>
+          <w:color w:val="595959"/>
+          <w:sz w:val="19"/>
+          <w:szCs w:val="19"/>
+        </w:rPr>
+        <w:t>o</w:t>
+      </w:r>
+      <w:r>
+        <w:rPr>
+          <w:rFonts w:ascii="Arial" w:eastAsia="Arial" w:hAnsi="Arial" w:cs="Arial"/>
+          <w:color w:val="595959"/>
+          <w:sz w:val="19"/>
+          <w:szCs w:val="19"/>
+        </w:rPr>
+        <w:t xml:space="preserve"> </w:t>
+      </w:r>
+    </w:p>
+    <w:p>
+      <w:pPr>
+        <w:pStyle w:val="ListParagraph"/>
+        <w:numPr>
+          <w:ilvl w:val="0"/>
+          <w:numId w:val="2"/>
+        </w:numPr>
+        <w:spacing w:after="60"/>
+        <w:rPr>
+          <w:rFonts w:ascii="Arial" w:eastAsia="Arial" w:hAnsi="Arial" w:cs="Arial"/>
+          <w:color w:val="595959"/>
+          <w:sz w:val="19"/>
+          <w:szCs w:val="19"/>
+        </w:rPr>
+      </w:pPr>
+      <w:r>
+        <w:rPr>
+          <w:rFonts w:ascii="Arial" w:eastAsia="Arial" w:hAnsi="Arial" w:cs="Arial"/>
+          <w:color w:val="595959"/>
+          <w:sz w:val="19"/>
+          <w:szCs w:val="19"/>
+        </w:rPr>
+        <w:t>Packaged the whole thing as a proper Power Platform solution with publisher details, versioning, and pipeline support built to be moved between environments</w:t>
+      </w:r>
+      <w:r>
+        <w:rPr>
+          <w:rFonts w:ascii="Arial" w:eastAsia="Arial" w:hAnsi="Arial" w:cs="Arial"/>
+          <w:color w:val="595959"/>
+          <w:sz w:val="19"/>
+          <w:szCs w:val="19"/>
+        </w:rPr>
+        <w:t xml:space="preserve">. </w:t>
+      </w:r>
+    </w:p>
     <w:p>
       <w:pPr>
         <w:spacing w:before="280" w:after="40"/>
@@ -487,12 +967,6 @@
         <w:gridCol w:w="7160"/>
       </w:tblGrid>
       <w:tr>
-        <w:tblPrEx>
-          <w:tblCellMar>
-            <w:top w:w="0" w:type="dxa"/>
-            <w:bottom w:w="0" w:type="dxa"/>
-          </w:tblCellMar>
-        </w:tblPrEx>
         <w:tc>
           <w:tcPr>
             <w:tcW w:w="2200" w:type="dxa"/>
@@ -542,12 +1016,6 @@
         </w:tc>
       </w:tr>
       <w:tr>
-        <w:tblPrEx>
-          <w:tblCellMar>
-            <w:top w:w="0" w:type="dxa"/>
-            <w:bottom w:w="0" w:type="dxa"/>
-          </w:tblCellMar>
-        </w:tblPrEx>
         <w:tc>
           <w:tcPr>
             <w:tcW w:w="2200" w:type="dxa"/>
@@ -597,12 +1065,6 @@
         </w:tc>
       </w:tr>
       <w:tr>
-        <w:tblPrEx>
-          <w:tblCellMar>
-            <w:top w:w="0" w:type="dxa"/>
-            <w:bottom w:w="0" w:type="dxa"/>
-          </w:tblCellMar>
-        </w:tblPrEx>
         <w:tc>
           <w:tcPr>
             <w:tcW w:w="2200" w:type="dxa"/>
@@ -652,12 +1114,6 @@
         </w:tc>
       </w:tr>
       <w:tr>
-        <w:tblPrEx>
-          <w:tblCellMar>
-            <w:top w:w="0" w:type="dxa"/>
-            <w:bottom w:w="0" w:type="dxa"/>
-          </w:tblCellMar>
-        </w:tblPrEx>
         <w:tc>
           <w:tcPr>
             <w:tcW w:w="2200" w:type="dxa"/>
@@ -707,12 +1163,6 @@
         </w:tc>
       </w:tr>
       <w:tr>
-        <w:tblPrEx>
-          <w:tblCellMar>
-            <w:top w:w="0" w:type="dxa"/>
-            <w:bottom w:w="0" w:type="dxa"/>
-          </w:tblCellMar>
-        </w:tblPrEx>
         <w:tc>
           <w:tcPr>
             <w:tcW w:w="2200" w:type="dxa"/>
@@ -762,12 +1212,6 @@
         </w:tc>
       </w:tr>
       <w:tr>
-        <w:tblPrEx>
-          <w:tblCellMar>
-            <w:top w:w="0" w:type="dxa"/>
-            <w:bottom w:w="0" w:type="dxa"/>
-          </w:tblCellMar>
-        </w:tblPrEx>
         <w:tc>
           <w:tcPr>
             <w:tcW w:w="2200" w:type="dxa"/>
@@ -817,12 +1261,6 @@
         </w:tc>
       </w:tr>
       <w:tr>
-        <w:tblPrEx>
-          <w:tblCellMar>
-            <w:top w:w="0" w:type="dxa"/>
-            <w:bottom w:w="0" w:type="dxa"/>
-          </w:tblCellMar>
-        </w:tblPrEx>
         <w:tc>
           <w:tcPr>
             <w:tcW w:w="2200" w:type="dxa"/>
@@ -844,7 +1282,6 @@
                 <w:sz w:val="19"/>
                 <w:szCs w:val="19"/>
               </w:rPr>
-              <w:lastRenderedPageBreak/>
               <w:t>Methodology</w:t>
             </w:r>
           </w:p>
@@ -1407,7 +1844,17 @@
           <w:sz w:val="19"/>
           <w:szCs w:val="19"/>
         </w:rPr>
-        <w:t xml:space="preserve">Built using React, Node.js, Express, and </w:t>
+        <w:lastRenderedPageBreak/>
+        <w:t>Built using React, Node.js, Express,</w:t>
+      </w:r>
+      <w:r>
+        <w:rPr>
+          <w:rFonts w:ascii="Arial" w:eastAsia="Arial" w:hAnsi="Arial" w:cs="Arial"/>
+          <w:color w:val="595959"/>
+          <w:sz w:val="19"/>
+          <w:szCs w:val="19"/>
+        </w:rPr>
+        <w:t xml:space="preserve"> </w:t>
       </w:r>
       <w:proofErr w:type="spellStart"/>
       <w:r>
@@ -1417,7 +1864,7 @@
           <w:sz w:val="19"/>
           <w:szCs w:val="19"/>
         </w:rPr>
-        <w:t>Supabase</w:t>
+        <w:t>Supase</w:t>
       </w:r>
       <w:proofErr w:type="spellEnd"/>
       <w:r>
@@ -1427,7 +1874,16 @@
           <w:sz w:val="19"/>
           <w:szCs w:val="19"/>
         </w:rPr>
-        <w:t xml:space="preserve"> — deployed live on </w:t>
+        <w:t xml:space="preserve"> as the backend and </w:t>
+      </w:r>
+      <w:r>
+        <w:rPr>
+          <w:rFonts w:ascii="Arial" w:eastAsia="Arial" w:hAnsi="Arial" w:cs="Arial"/>
+          <w:color w:val="595959"/>
+          <w:sz w:val="19"/>
+          <w:szCs w:val="19"/>
+        </w:rPr>
+        <w:t xml:space="preserve">deployed live on </w:t>
       </w:r>
       <w:proofErr w:type="spellStart"/>
       <w:r>
@@ -1628,6 +2084,119 @@
     </w:lvl>
   </w:abstractNum>
   <w:abstractNum w:abstractNumId="1" w15:restartNumberingAfterBreak="0">
+    <w:nsid w:val="2C2425B5"/>
+    <w:multiLevelType w:val="hybridMultilevel"/>
+    <w:tmpl w:val="898AD8D4"/>
+    <w:lvl w:ilvl="0" w:tplc="08090001">
+      <w:start w:val="1"/>
+      <w:numFmt w:val="bullet"/>
+      <w:lvlText w:val=""/>
+      <w:lvlJc w:val="left"/>
+      <w:pPr>
+        <w:ind w:left="720" w:hanging="360"/>
+      </w:pPr>
+      <w:rPr>
+        <w:rFonts w:ascii="Symbol" w:hAnsi="Symbol" w:hint="default"/>
+      </w:rPr>
+    </w:lvl>
+    <w:lvl w:ilvl="1" w:tplc="08090003" w:tentative="1">
+      <w:start w:val="1"/>
+      <w:numFmt w:val="bullet"/>
+      <w:lvlText w:val="o"/>
+      <w:lvlJc w:val="left"/>
+      <w:pPr>
+        <w:ind w:left="1440" w:hanging="360"/>
+      </w:pPr>
+      <w:rPr>
+        <w:rFonts w:ascii="Courier New" w:hAnsi="Courier New" w:cs="Courier New" w:hint="default"/>
+      </w:rPr>
+    </w:lvl>
+    <w:lvl w:ilvl="2" w:tplc="08090005" w:tentative="1">
+      <w:start w:val="1"/>
+      <w:numFmt w:val="bullet"/>
+      <w:lvlText w:val=""/>
+      <w:lvlJc w:val="left"/>
+      <w:pPr>
+        <w:ind w:left="2160" w:hanging="360"/>
+      </w:pPr>
+      <w:rPr>
+        <w:rFonts w:ascii="Wingdings" w:hAnsi="Wingdings" w:hint="default"/>
+      </w:rPr>
+    </w:lvl>
+    <w:lvl w:ilvl="3" w:tplc="08090001" w:tentative="1">
+      <w:start w:val="1"/>
+      <w:numFmt w:val="bullet"/>
+      <w:lvlText w:val=""/>
+      <w:lvlJc w:val="left"/>
+      <w:pPr>
+        <w:ind w:left="2880" w:hanging="360"/>
+      </w:pPr>
+      <w:rPr>
+        <w:rFonts w:ascii="Symbol" w:hAnsi="Symbol" w:hint="default"/>
+      </w:rPr>
+    </w:lvl>
+    <w:lvl w:ilvl="4" w:tplc="08090003" w:tentative="1">
+      <w:start w:val="1"/>
+      <w:numFmt w:val="bullet"/>
+      <w:lvlText w:val="o"/>
+      <w:lvlJc w:val="left"/>
+      <w:pPr>
+        <w:ind w:left="3600" w:hanging="360"/>
+      </w:pPr>
+      <w:rPr>
+        <w:rFonts w:ascii="Courier New" w:hAnsi="Courier New" w:cs="Courier New" w:hint="default"/>
+      </w:rPr>
+    </w:lvl>
+    <w:lvl w:ilvl="5" w:tplc="08090005" w:tentative="1">
+      <w:start w:val="1"/>
+      <w:numFmt w:val="bullet"/>
+      <w:lvlText w:val=""/>
+      <w:lvlJc w:val="left"/>
+      <w:pPr>
+        <w:ind w:left="4320" w:hanging="360"/>
+      </w:pPr>
+      <w:rPr>
+        <w:rFonts w:ascii="Wingdings" w:hAnsi="Wingdings" w:hint="default"/>
+      </w:rPr>
+    </w:lvl>
+    <w:lvl w:ilvl="6" w:tplc="08090001" w:tentative="1">
+      <w:start w:val="1"/>
+      <w:numFmt w:val="bullet"/>
+      <w:lvlText w:val=""/>
+      <w:lvlJc w:val="left"/>
+      <w:pPr>
+        <w:ind w:left="5040" w:hanging="360"/>
+      </w:pPr>
+      <w:rPr>
+        <w:rFonts w:ascii="Symbol" w:hAnsi="Symbol" w:hint="default"/>
+      </w:rPr>
+    </w:lvl>
+    <w:lvl w:ilvl="7" w:tplc="08090003" w:tentative="1">
+      <w:start w:val="1"/>
+      <w:numFmt w:val="bullet"/>
+      <w:lvlText w:val="o"/>
+      <w:lvlJc w:val="left"/>
+      <w:pPr>
+        <w:ind w:left="5760" w:hanging="360"/>
+      </w:pPr>
+      <w:rPr>
+        <w:rFonts w:ascii="Courier New" w:hAnsi="Courier New" w:cs="Courier New" w:hint="default"/>
+      </w:rPr>
+    </w:lvl>
+    <w:lvl w:ilvl="8" w:tplc="08090005" w:tentative="1">
+      <w:start w:val="1"/>
+      <w:numFmt w:val="bullet"/>
+      <w:lvlText w:val=""/>
+      <w:lvlJc w:val="left"/>
+      <w:pPr>
+        <w:ind w:left="6480" w:hanging="360"/>
+      </w:pPr>
+      <w:rPr>
+        <w:rFonts w:ascii="Wingdings" w:hAnsi="Wingdings" w:hint="default"/>
+      </w:rPr>
+    </w:lvl>
+  </w:abstractNum>
+  <w:abstractNum w:abstractNumId="2" w15:restartNumberingAfterBreak="0">
     <w:nsid w:val="528B63C4"/>
     <w:multiLevelType w:val="hybridMultilevel"/>
     <w:tmpl w:val="97BCA3A4"/>
@@ -1713,8 +2282,121 @@
       </w:pPr>
     </w:lvl>
   </w:abstractNum>
+  <w:abstractNum w:abstractNumId="3" w15:restartNumberingAfterBreak="0">
+    <w:nsid w:val="56222DC5"/>
+    <w:multiLevelType w:val="hybridMultilevel"/>
+    <w:tmpl w:val="5EE28C0C"/>
+    <w:lvl w:ilvl="0" w:tplc="08090001">
+      <w:start w:val="1"/>
+      <w:numFmt w:val="bullet"/>
+      <w:lvlText w:val=""/>
+      <w:lvlJc w:val="left"/>
+      <w:pPr>
+        <w:ind w:left="720" w:hanging="360"/>
+      </w:pPr>
+      <w:rPr>
+        <w:rFonts w:ascii="Symbol" w:hAnsi="Symbol" w:hint="default"/>
+      </w:rPr>
+    </w:lvl>
+    <w:lvl w:ilvl="1" w:tplc="08090003" w:tentative="1">
+      <w:start w:val="1"/>
+      <w:numFmt w:val="bullet"/>
+      <w:lvlText w:val="o"/>
+      <w:lvlJc w:val="left"/>
+      <w:pPr>
+        <w:ind w:left="1440" w:hanging="360"/>
+      </w:pPr>
+      <w:rPr>
+        <w:rFonts w:ascii="Courier New" w:hAnsi="Courier New" w:cs="Courier New" w:hint="default"/>
+      </w:rPr>
+    </w:lvl>
+    <w:lvl w:ilvl="2" w:tplc="08090005" w:tentative="1">
+      <w:start w:val="1"/>
+      <w:numFmt w:val="bullet"/>
+      <w:lvlText w:val=""/>
+      <w:lvlJc w:val="left"/>
+      <w:pPr>
+        <w:ind w:left="2160" w:hanging="360"/>
+      </w:pPr>
+      <w:rPr>
+        <w:rFonts w:ascii="Wingdings" w:hAnsi="Wingdings" w:hint="default"/>
+      </w:rPr>
+    </w:lvl>
+    <w:lvl w:ilvl="3" w:tplc="08090001" w:tentative="1">
+      <w:start w:val="1"/>
+      <w:numFmt w:val="bullet"/>
+      <w:lvlText w:val=""/>
+      <w:lvlJc w:val="left"/>
+      <w:pPr>
+        <w:ind w:left="2880" w:hanging="360"/>
+      </w:pPr>
+      <w:rPr>
+        <w:rFonts w:ascii="Symbol" w:hAnsi="Symbol" w:hint="default"/>
+      </w:rPr>
+    </w:lvl>
+    <w:lvl w:ilvl="4" w:tplc="08090003" w:tentative="1">
+      <w:start w:val="1"/>
+      <w:numFmt w:val="bullet"/>
+      <w:lvlText w:val="o"/>
+      <w:lvlJc w:val="left"/>
+      <w:pPr>
+        <w:ind w:left="3600" w:hanging="360"/>
+      </w:pPr>
+      <w:rPr>
+        <w:rFonts w:ascii="Courier New" w:hAnsi="Courier New" w:cs="Courier New" w:hint="default"/>
+      </w:rPr>
+    </w:lvl>
+    <w:lvl w:ilvl="5" w:tplc="08090005" w:tentative="1">
+      <w:start w:val="1"/>
+      <w:numFmt w:val="bullet"/>
+      <w:lvlText w:val=""/>
+      <w:lvlJc w:val="left"/>
+      <w:pPr>
+        <w:ind w:left="4320" w:hanging="360"/>
+      </w:pPr>
+      <w:rPr>
+        <w:rFonts w:ascii="Wingdings" w:hAnsi="Wingdings" w:hint="default"/>
+      </w:rPr>
+    </w:lvl>
+    <w:lvl w:ilvl="6" w:tplc="08090001" w:tentative="1">
+      <w:start w:val="1"/>
+      <w:numFmt w:val="bullet"/>
+      <w:lvlText w:val=""/>
+      <w:lvlJc w:val="left"/>
+      <w:pPr>
+        <w:ind w:left="5040" w:hanging="360"/>
+      </w:pPr>
+      <w:rPr>
+        <w:rFonts w:ascii="Symbol" w:hAnsi="Symbol" w:hint="default"/>
+      </w:rPr>
+    </w:lvl>
+    <w:lvl w:ilvl="7" w:tplc="08090003" w:tentative="1">
+      <w:start w:val="1"/>
+      <w:numFmt w:val="bullet"/>
+      <w:lvlText w:val="o"/>
+      <w:lvlJc w:val="left"/>
+      <w:pPr>
+        <w:ind w:left="5760" w:hanging="360"/>
+      </w:pPr>
+      <w:rPr>
+        <w:rFonts w:ascii="Courier New" w:hAnsi="Courier New" w:cs="Courier New" w:hint="default"/>
+      </w:rPr>
+    </w:lvl>
+    <w:lvl w:ilvl="8" w:tplc="08090005" w:tentative="1">
+      <w:start w:val="1"/>
+      <w:numFmt w:val="bullet"/>
+      <w:lvlText w:val=""/>
+      <w:lvlJc w:val="left"/>
+      <w:pPr>
+        <w:ind w:left="6480" w:hanging="360"/>
+      </w:pPr>
+      <w:rPr>
+        <w:rFonts w:ascii="Wingdings" w:hAnsi="Wingdings" w:hint="default"/>
+      </w:rPr>
+    </w:lvl>
+  </w:abstractNum>
   <w:num w:numId="1" w16cid:durableId="306399557">
-    <w:abstractNumId w:val="1"/>
+    <w:abstractNumId w:val="2"/>
     <w:lvlOverride w:ilvl="0">
       <w:startOverride w:val="1"/>
     </w:lvlOverride>
@@ -1724,6 +2406,12 @@
     <w:lvlOverride w:ilvl="0">
       <w:startOverride w:val="1"/>
     </w:lvlOverride>
+  </w:num>
+  <w:num w:numId="3" w16cid:durableId="1955868255">
+    <w:abstractNumId w:val="1"/>
+  </w:num>
+  <w:num w:numId="4" w16cid:durableId="151262460">
+    <w:abstractNumId w:val="3"/>
   </w:num>
 </w:numbering>
 </file>
@@ -2208,7 +2896,6 @@
   <w:style w:type="character" w:default="1" w:styleId="DefaultParagraphFont">
     <w:name w:val="Default Paragraph Font"/>
     <w:uiPriority w:val="1"/>
-    <w:semiHidden/>
     <w:unhideWhenUsed/>
   </w:style>
   <w:style w:type="table" w:default="1" w:styleId="TableNormal">
@@ -2314,6 +3001,18 @@
     <w:rPr>
       <w:sz w:val="20"/>
       <w:szCs w:val="20"/>
+    </w:rPr>
+  </w:style>
+  <w:style w:type="character" w:styleId="FollowedHyperlink">
+    <w:name w:val="FollowedHyperlink"/>
+    <w:basedOn w:val="DefaultParagraphFont"/>
+    <w:uiPriority w:val="99"/>
+    <w:semiHidden/>
+    <w:unhideWhenUsed/>
+    <w:rsid w:val="00054BFE"/>
+    <w:rPr>
+      <w:color w:val="96607D" w:themeColor="followedHyperlink"/>
+      <w:u w:val="single"/>
     </w:rPr>
   </w:style>
 </w:styles>

</xml_diff>